<commit_message>
Correct S1 rounding calculation
</commit_message>
<xml_diff>
--- a/PSP_1_etapas.docx
+++ b/PSP_1_etapas.docx
@@ -1328,7 +1328,10 @@
         </w:numPr>
       </w:pPr>
       <w:r>
-        <w:t>R6. Piniginės sumos ir PVM. Sumos saugomos naudojant `decimal` duomenų tipą su dviejų skaitmenų po kablelio tikslumu. Kiekviena nuolaida ir PVM suma apvalinama naudojant numatytąjį .NET aplinkos `Math.Round` metodą, kuris apvalina iki artimiausio lyginio skaičiaus. PVM skaičiuojamas vieną kartą nuo bendros sumos po nuolaidų pritaikymo, o ne atskirai kiekvienai eilutei.</w:t>
+        <w:t xml:space="preserve">R6. </w:t>
+      </w:r>
+      <w:r>
+        <w:t>Kiekviena nuolaida ir PVM suma apvalinama iki 2 skaitmenų po kablelio naudojant Math.Round(suma, 2) su numatytąja MidpointRounding.ToEven taisykle (apvalinimas iki artimiausio lyginio). Tarpinės skaičiavimo reikšmės prieš apvalinimą išlaikomos pakankamu tikslumu. PVM skaičiuojamas vieną kartą nuo bendros sumos po nuolaidų pritaikymo, o ne atskirai kiekvienai eilutei.</w:t>
       </w:r>
     </w:p>
     <w:p>
@@ -1570,20 +1573,40 @@
           <w:p>
             <w:pPr>
               <w:spacing w:after="0" w:line="240" w:lineRule="exact"/>
+              <w:rPr>
+                <w:sz w:val="18"/>
+                <w:lang w:val="en-US"/>
+              </w:rPr>
             </w:pPr>
             <w:r>
               <w:rPr>
                 <w:sz w:val="18"/>
+                <w:lang w:val="en-US"/>
               </w:rPr>
-              <w:t xml:space="preserve">DEV -&gt; 495 min = 8,25 val. * 50 = 412,50; CONS = 2 val. * 70 = 140,00. Bendras laikas 10,25 val. -&gt; apimties nuolaida 5 %. Tarpinė 552,50; nuolaida 27,63 (27,625 apvalinama aukštyn); be PVM 524,87; PVM 21 % = 110,22; </w:t>
+              <w:t xml:space="preserve">DEV → 495 min = 8,25 val. × 50 = 412,50 €; CONS = 2 val. × 70 = 140,00 €. Bendras laikas – 10,25 val., todėl taikoma 5 % apimties nuolaida. Tarpinė suma – 552,50 €. Nuolaida: 552,50 × 5 % = 27,625 €, apvalinus iki 2 skaitmenų po kablelio pagal R6 taisyklę (iki artimiausio lyginio), gaunama 27,62 €. Suma be PVM – 524,88 €. PVM (21 %) – 110,22 €. Galutinė suma – </w:t>
             </w:r>
             <w:r>
               <w:rPr>
                 <w:b/>
                 <w:bCs/>
                 <w:sz w:val="18"/>
+                <w:lang w:val="en-US"/>
               </w:rPr>
-              <w:t>iš viso 635,09</w:t>
+              <w:t>635,10</w:t>
+            </w:r>
+            <w:r>
+              <w:rPr>
+                <w:sz w:val="18"/>
+                <w:lang w:val="en-US"/>
+              </w:rPr>
+              <w:t xml:space="preserve"> €</w:t>
+            </w:r>
+            <w:r>
+              <w:rPr>
+                <w:sz w:val="18"/>
+                <w:lang w:val="en-US"/>
+              </w:rPr>
+              <w:t>.</w:t>
             </w:r>
           </w:p>
         </w:tc>
@@ -2066,6 +2089,7 @@
         <w:rPr>
           <w:b/>
         </w:rPr>
+        <w:lastRenderedPageBreak/>
         <w:t>Tikrinimo scenarijus ir sąlygos:</w:t>
       </w:r>
       <w:r>
@@ -2116,7 +2140,6 @@
         </w:numPr>
       </w:pPr>
       <w:r>
-        <w:lastRenderedPageBreak/>
         <w:t>visi anksčiau parašyti testai praeina be pakeitimų</w:t>
       </w:r>
     </w:p>
@@ -2151,11 +2174,6 @@
       </w:r>
     </w:p>
     <w:p>
-      <w:pPr>
-        <w:rPr>
-          <w:lang w:val="ru-RU"/>
-        </w:rPr>
-      </w:pPr>
       <w:r>
         <w:rPr>
           <w:b/>
@@ -2447,16 +2465,7 @@
         <w:t xml:space="preserve"> </w:t>
       </w:r>
       <w:r>
-        <w:rPr>
-          <w:lang w:val="en-US"/>
-        </w:rPr>
-        <w:t>(</w:t>
-      </w:r>
-      <w:r>
-        <w:rPr>
-          <w:lang w:val="en-US"/>
-        </w:rPr>
-        <w:t>G</w:t>
+        <w:t>(G</w:t>
       </w:r>
       <w:r>
         <w:t xml:space="preserve">ali būti pridėti papildomi apsaugos sluoksniai, pavyzdžiui, </w:t>
@@ -6626,7 +6635,6 @@
   <w:style w:type="character" w:default="1" w:styleId="DefaultParagraphFont">
     <w:name w:val="Default Paragraph Font"/>
     <w:uiPriority w:val="1"/>
-    <w:semiHidden/>
     <w:unhideWhenUsed/>
   </w:style>
   <w:style w:type="table" w:default="1" w:styleId="TableNormal">

</xml_diff>